<commit_message>
Record Deel decision; add cross-eval v2, CEO review, and branded deck
Owner decided Deel: Rippling held the auto-renewal clause (the pre-registered
§9 tripwire) and does not lease IT devices, so the call flips to Deel exactly
as the memo's conditional logic specified.

- Decision Memo updated to DECIDED — Deel (+ §12 Deel-specific actions)
- CrossEval v2: single-model adversarial review of the final Deel decision
  (Claude-only; genuine second-model pass still pending Gemini access in-sandbox)
- CEO-lens review (inline; no CEO skill installed) — approve, conditional
- Novagentica-Deel-Decision.pptx: branded 6-slide internal decision deck
- Reproducibility: deck-build.js, render-memo-docx.py

Co-Authored-By: Claude Opus 4.8 <noreply@anthropic.com>
Claude-Session: https://claude.ai/code/session_01NL6Ze6k86DYXgast6w3QvE
</commit_message>
<xml_diff>
--- a/decisions/2026-06-24-deel-vs-rippling-backoffice-DecisionMemo-v1.0.docx
+++ b/decisions/2026-06-24-deel-vs-rippling-backoffice-DecisionMemo-v1.0.docx
@@ -33,7 +33,7 @@
           <w:color w:val="5C5C58"/>
           <w:sz w:val="22"/>
         </w:rPr>
-        <w:t xml:space="preserve"> AWAITING OWNER DECISION</w:t>
+        <w:t xml:space="preserve"> DECIDED — Deel (recorded 2026-06-24)</w:t>
       </w:r>
     </w:p>
     <w:p>
@@ -2579,8 +2579,19 @@
           <w:color w:val="5C5C58"/>
           <w:sz w:val="22"/>
         </w:rPr>
-        <w:t xml:space="preserve"> _______________   |   </w:t>
+        <w:t xml:space="preserve"> </w:t>
       </w:r>
+      <w:r>
+        <w:rPr>
+          <w:rFonts w:ascii="Georgia" w:hAnsi="Georgia"/>
+          <w:b/>
+          <w:color w:val="0E0E0C"/>
+          <w:sz w:val="22"/>
+        </w:rPr>
+        <w:t>Deel.</w:t>
+      </w:r>
+    </w:p>
+    <w:p>
       <w:r>
         <w:rPr>
           <w:rFonts w:ascii="Georgia" w:hAnsi="Georgia"/>
@@ -2596,7 +2607,77 @@
           <w:color w:val="5C5C58"/>
           <w:sz w:val="22"/>
         </w:rPr>
-        <w:t xml:space="preserve"> _______________ (+ one-line why each)</w:t>
+        <w:t xml:space="preserve"> </w:t>
+      </w:r>
+      <w:r>
+        <w:rPr>
+          <w:rFonts w:ascii="Georgia" w:hAnsi="Georgia"/>
+          <w:i/>
+          <w:color w:val="5C5C58"/>
+          <w:sz w:val="22"/>
+        </w:rPr>
+        <w:t>Rippling</w:t>
+      </w:r>
+      <w:r>
+        <w:rPr>
+          <w:rFonts w:ascii="Georgia" w:hAnsi="Georgia"/>
+          <w:color w:val="5C5C58"/>
+          <w:sz w:val="22"/>
+        </w:rPr>
+        <w:t xml:space="preserve"> — refused to remove the auto-renewal clause (the §9 tripwire), making the lock-in risk on an all-eggs single-vendor bet unacceptable; and Rippling does not lease IT devices, so a no-internal-IT team would still have to procure hardware separately. </w:t>
+      </w:r>
+      <w:r>
+        <w:rPr>
+          <w:rFonts w:ascii="Georgia" w:hAnsi="Georgia"/>
+          <w:i/>
+          <w:color w:val="5C5C58"/>
+          <w:sz w:val="22"/>
+        </w:rPr>
+        <w:t>Null (don't consolidate)</w:t>
+      </w:r>
+      <w:r>
+        <w:rPr>
+          <w:rFonts w:ascii="Georgia" w:hAnsi="Georgia"/>
+          <w:color w:val="5C5C58"/>
+          <w:sz w:val="22"/>
+        </w:rPr>
+        <w:t xml:space="preserve"> — forfeits the pre-signature leverage window and leaves HR/IT/payroll fragmented through the ramp, likely forcing an internal IT hire.</w:t>
+      </w:r>
+    </w:p>
+    <w:p>
+      <w:r>
+        <w:rPr>
+          <w:rFonts w:ascii="Georgia" w:hAnsi="Georgia"/>
+          <w:b/>
+          <w:color w:val="0E0E0C"/>
+          <w:sz w:val="22"/>
+        </w:rPr>
+        <w:t>Why this is consistent with the memo:</w:t>
+      </w:r>
+      <w:r>
+        <w:rPr>
+          <w:rFonts w:ascii="Georgia" w:hAnsi="Georgia"/>
+          <w:color w:val="5C5C58"/>
+          <w:sz w:val="22"/>
+        </w:rPr>
+        <w:t xml:space="preserve"> §5 recommended "Rippling </w:t>
+      </w:r>
+      <w:r>
+        <w:rPr>
+          <w:rFonts w:ascii="Georgia" w:hAnsi="Georgia"/>
+          <w:i/>
+          <w:color w:val="5C5C58"/>
+          <w:sz w:val="22"/>
+        </w:rPr>
+        <w:t>conditional</w:t>
+      </w:r>
+      <w:r>
+        <w:rPr>
+          <w:rFonts w:ascii="Georgia" w:hAnsi="Georgia"/>
+          <w:color w:val="5C5C58"/>
+          <w:sz w:val="22"/>
+        </w:rPr>
+        <w:t>, else Deel"; the condition failed — Rippling held the auto-renewal — so the §9 kill-criterion fired exactly as pre-registered, and the §10 General Counsel dissent ("unless auto-renewal is struck out in writing, Deel is the safer all-eggs partner") becomes the operative position. The new fact that Deel leases IT devices and Rippling does not reinforces the choice on the "no internal IT" goal.</w:t>
       </w:r>
     </w:p>
     <w:p>
@@ -2632,7 +2713,7 @@
           <w:color w:val="5C5C58"/>
           <w:sz w:val="22"/>
         </w:rPr>
-        <w:t xml:space="preserve"> __________</w:t>
+        <w:t xml:space="preserve"> 2026-06-24</w:t>
       </w:r>
     </w:p>
     <w:p>
@@ -2670,7 +2751,163 @@
           <w:color w:val="5C5C58"/>
           <w:sz w:val="22"/>
         </w:rPr>
-        <w:t xml:space="preserve"> Offer a 14-day cooldown (`/cs:freeze`) once a vendor is chosen — plugin not installed here, so freeze is recorded in this memo and the local decisions log rather than enforced by the tool.</w:t>
+        <w:t xml:space="preserve"> 14-day cooldown recommended before counter-signature (`/cs:freeze` not installed — recorded here). Given the decision rests on two firm facts (auto-renewal refused; no device leasing), the cooldown is a formality, not a reconsideration window.</w:t>
+      </w:r>
+    </w:p>
+    <w:p>
+      <w:pPr>
+        <w:spacing w:before="240" w:after="80"/>
+      </w:pPr>
+      <w:r>
+        <w:rPr>
+          <w:rFonts w:ascii="Inter" w:hAnsi="Inter"/>
+          <w:b/>
+          <w:color w:val="0E0E0C"/>
+          <w:sz w:val="26"/>
+        </w:rPr>
+        <w:t>12. What changes now — Deel-specific actions</w:t>
+      </w:r>
+    </w:p>
+    <w:p>
+      <w:r>
+        <w:rPr>
+          <w:rFonts w:ascii="Georgia" w:hAnsi="Georgia"/>
+          <w:color w:val="5C5C58"/>
+          <w:sz w:val="22"/>
+        </w:rPr>
+        <w:t>Choosing Deel accepts two known weaknesses (USD/FX exposure; Felix's prior failed Deel go-live) for two firm advantages (no auto-renew + locked rate; IT device leasing). The mitigations that were optional for Rippling are now mandatory:</w:t>
+      </w:r>
+    </w:p>
+    <w:p>
+      <w:pPr>
+        <w:pStyle w:val="ListBullet"/>
+        <w:spacing w:after="60"/>
+      </w:pPr>
+      <w:r>
+        <w:rPr>
+          <w:rFonts w:ascii="Georgia" w:hAnsi="Georgia"/>
+          <w:b/>
+          <w:color w:val="0E0E0C"/>
+          <w:sz w:val="21"/>
+        </w:rPr>
+        <w:t>Confirm the DE country fee / GP entity cost before counter-signing</w:t>
+      </w:r>
+      <w:r>
+        <w:rPr>
+          <w:rFonts w:ascii="Georgia" w:hAnsi="Georgia"/>
+          <w:color w:val="5C5C58"/>
+          <w:sz w:val="21"/>
+        </w:rPr>
+        <w:t xml:space="preserve"> — the workbook flags it "may be MANDATORY for EOR." We are not choosing Deel on price, so a modest increase is acceptable, but it must be known and budgeted (§9 kill-criterion still applies if it is large).</w:t>
+      </w:r>
+    </w:p>
+    <w:p>
+      <w:pPr>
+        <w:pStyle w:val="ListBullet"/>
+        <w:spacing w:after="60"/>
+      </w:pPr>
+      <w:r>
+        <w:rPr>
+          <w:rFonts w:ascii="Georgia" w:hAnsi="Georgia"/>
+          <w:b/>
+          <w:color w:val="0E0E0C"/>
+          <w:sz w:val="21"/>
+        </w:rPr>
+        <w:t>Manage USD/FX exposure</w:t>
+      </w:r>
+      <w:r>
+        <w:rPr>
+          <w:rFonts w:ascii="Georgia" w:hAnsi="Georgia"/>
+          <w:color w:val="5C5C58"/>
+          <w:sz w:val="21"/>
+        </w:rPr>
+        <w:t xml:space="preserve"> — Deel is USD-billed. Budget at the weak-EUR case (~€105.7k over 2 yrs vs €97.2k base) and seek a fixed-FX clause or a simple USD hedge.</w:t>
+      </w:r>
+    </w:p>
+    <w:p>
+      <w:pPr>
+        <w:pStyle w:val="ListBullet"/>
+        <w:spacing w:after="60"/>
+      </w:pPr>
+      <w:r>
+        <w:rPr>
+          <w:rFonts w:ascii="Georgia" w:hAnsi="Georgia"/>
+          <w:b/>
+          <w:color w:val="0E0E0C"/>
+          <w:sz w:val="21"/>
+        </w:rPr>
+        <w:t>De-risk the implementation Felix got burned by</w:t>
+      </w:r>
+      <w:r>
+        <w:rPr>
+          <w:rFonts w:ascii="Georgia" w:hAnsi="Georgia"/>
+          <w:color w:val="5C5C58"/>
+          <w:sz w:val="21"/>
+        </w:rPr>
+        <w:t xml:space="preserve"> — the headline accepted risk. Reference calls including a </w:t>
+      </w:r>
+      <w:r>
+        <w:rPr>
+          <w:rFonts w:ascii="Georgia" w:hAnsi="Georgia"/>
+          <w:i/>
+          <w:color w:val="5C5C58"/>
+          <w:sz w:val="21"/>
+        </w:rPr>
+        <w:t>recovered</w:t>
+      </w:r>
+      <w:r>
+        <w:rPr>
+          <w:rFonts w:ascii="Georgia" w:hAnsi="Georgia"/>
+          <w:color w:val="5C5C58"/>
+          <w:sz w:val="21"/>
+        </w:rPr>
+        <w:t xml:space="preserve"> failed Deel go-live; a parallel payroll run to two consecutive clean cycles before cutover; named OBM/CSM + SLA response times in writing.</w:t>
+      </w:r>
+    </w:p>
+    <w:p>
+      <w:pPr>
+        <w:pStyle w:val="ListBullet"/>
+        <w:spacing w:after="60"/>
+      </w:pPr>
+      <w:r>
+        <w:rPr>
+          <w:rFonts w:ascii="Georgia" w:hAnsi="Georgia"/>
+          <w:b/>
+          <w:color w:val="0E0E0C"/>
+          <w:sz w:val="21"/>
+        </w:rPr>
+        <w:t>Lock Deel's strengths in writing</w:t>
+      </w:r>
+      <w:r>
+        <w:rPr>
+          <w:rFonts w:ascii="Georgia" w:hAnsi="Georgia"/>
+          <w:color w:val="5C5C58"/>
+          <w:sz w:val="21"/>
+        </w:rPr>
+        <w:t xml:space="preserve"> — no auto-renewal + the locked rate, plus data-export / exit-assistance and SLAs with service credits.</w:t>
+      </w:r>
+    </w:p>
+    <w:p>
+      <w:pPr>
+        <w:pStyle w:val="ListBullet"/>
+        <w:spacing w:after="60"/>
+      </w:pPr>
+      <w:r>
+        <w:rPr>
+          <w:rFonts w:ascii="Georgia" w:hAnsi="Georgia"/>
+          <w:b/>
+          <w:color w:val="0E0E0C"/>
+          <w:sz w:val="21"/>
+        </w:rPr>
+        <w:t>Confirm device-leasing scope in the order</w:t>
+      </w:r>
+      <w:r>
+        <w:rPr>
+          <w:rFonts w:ascii="Georgia" w:hAnsi="Georgia"/>
+          <w:color w:val="5C5C58"/>
+          <w:sz w:val="21"/>
+        </w:rPr>
+        <w:t xml:space="preserve"> — procure → deploy → manage → return terms, since device leasing is a stated reason for the choice.</w:t>
       </w:r>
     </w:p>
     <w:p>

</xml_diff>